<commit_message>
Expand gas venting report: three-option venting analysis and conclusion
</commit_message>
<xml_diff>
--- a/GAS/e-PU10 V2_Gas venting calculations V2 (updated model).docx
+++ b/GAS/e-PU10 V2_Gas venting calculations V2 (updated model).docx
@@ -4955,7 +4955,51 @@
         <w:pStyle w:val="Kop1"/>
       </w:pPr>
       <w:r>
-        <w:t>7  Final recommendation</w:t>
+        <w:t>7  Practical venting solutions</w:t>
+      </w:r>
+    </w:p>
+    <w:p>
+      <w:pPr/>
+      <w:r>
+        <w:t>The validated model shows that a net free vent area of 0.03 m² keeps the hydrogen concentration below the 1 %vol design limit throughout the release. A permanently open hole of this size is, however, undesirable in service because it admits dust, dirt, insects and water into the container. This section evaluates three practical ways of providing the required venting duty and selects the most suitable for the e-PU10:</w:t>
+      </w:r>
+    </w:p>
+    <w:p>
+      <w:pPr>
+        <w:pStyle w:val="Lijstopsomteken"/>
+      </w:pPr>
+      <w:r>
+        <w:t>Option 1 – Open vent area: the existing 0.03 m² louvred opening.</w:t>
+      </w:r>
+    </w:p>
+    <w:p>
+      <w:pPr>
+        <w:pStyle w:val="Lijstopsomteken"/>
+      </w:pPr>
+      <w:r>
+        <w:t>Option 2 – G4 air filter (EN 779 classification, or the equivalent ISO 16890 coarse filter).</w:t>
+      </w:r>
+    </w:p>
+    <w:p>
+      <w:pPr>
+        <w:pStyle w:val="Lijstopsomteken"/>
+      </w:pPr>
+      <w:r>
+        <w:t>Option 3 – Overpressure (pressure-relief) valve instead of a permanently open vent.</w:t>
+      </w:r>
+    </w:p>
+    <w:p>
+      <w:pPr/>
+      <w:r>
+        <w:t>Governing venting duty. The peak hydrogen concentration is set almost entirely by the pressure-driven exchange during the release peak at t ≈ 29 s. At that instant the open 0.03 m² vent passes a peak flow of about 0.223 m³/s at a pressure difference of only ≈ 79 Pa (peak face velocity ≈ 7.4 m/s). A supplementary run of the validated model with the pressure-driven flow suppressed (diffusion exchange only, Q_diff = k_diff·A) gives a peak concentration of 2.67 %vol; the diffusive term therefore only flushes the container after the event and cannot by itself hold the 1 %vol limit. Any practical solution must preserve this low-pressure, high-flow exchange capacity during the transient. This is the criterion against which the three options are sized below.</w:t>
+      </w:r>
+    </w:p>
+    <w:p>
+      <w:pPr>
+        <w:pStyle w:val="Kop2"/>
+      </w:pPr>
+      <w:r>
+        <w:t>7.1  Option 1 – Open vent area (baseline)</w:t>
       </w:r>
     </w:p>
     <w:p>
@@ -5243,6 +5287,1445 @@
       </w:r>
     </w:p>
     <w:p>
+      <w:pPr/>
+      <w:r>
+        <w:t>Why Option 1 requires the smallest area. An open sharp-edged orifice has the lowest possible flow resistance (discharge coefficient C_d ≈ 0.65 and no added media). For a given pressure difference it therefore passes the largest flow and reaches the 1 %vol limit with the smallest geometric area (0.03 m²; threshold ≈ 0.028 m²). Every element added in the flow path (louvre, mesh, filter or valve) increases resistance and requires a correspondingly larger physical opening to preserve the same net effective flow.</w:t>
+      </w:r>
+    </w:p>
+    <w:p>
+      <w:pPr/>
+      <w:r>
+        <w:t>Advantages of Option 1:</w:t>
+      </w:r>
+    </w:p>
+    <w:p>
+      <w:pPr>
+        <w:pStyle w:val="Lijstopsomteken"/>
+      </w:pPr>
+      <w:r>
+        <w:t>Lowest flow resistance, hence the smallest required area (0.03 m²).</w:t>
+      </w:r>
+    </w:p>
+    <w:p>
+      <w:pPr>
+        <w:pStyle w:val="Lijstopsomteken"/>
+      </w:pPr>
+      <w:r>
+        <w:t>No moving parts, no power, cannot fail to open – inherently reliable during a fault.</w:t>
+      </w:r>
+    </w:p>
+    <w:p>
+      <w:pPr>
+        <w:pStyle w:val="Lijstopsomteken"/>
+      </w:pPr>
+      <w:r>
+        <w:t>Negligible internal pressure rise (≈ 79 Pa).</w:t>
+      </w:r>
+    </w:p>
+    <w:p>
+      <w:pPr>
+        <w:pStyle w:val="Lijstopsomteken"/>
+      </w:pPr>
+      <w:r>
+        <w:t>Lowest cost and effectively maintenance-free.</w:t>
+      </w:r>
+    </w:p>
+    <w:p>
+      <w:pPr/>
+      <w:r>
+        <w:t>Disadvantages of Option 1:</w:t>
+      </w:r>
+    </w:p>
+    <w:p>
+      <w:pPr>
+        <w:pStyle w:val="Lijstopsomteken"/>
+      </w:pPr>
+      <w:r>
+        <w:t>No protection against dust, dirt, insects or water ingress.</w:t>
+      </w:r>
+    </w:p>
+    <w:p>
+      <w:pPr>
+        <w:pStyle w:val="Lijstopsomteken"/>
+      </w:pPr>
+      <w:r>
+        <w:t>Open path for external ignition (a flame arrestor must be added).</w:t>
+      </w:r>
+    </w:p>
+    <w:p>
+      <w:pPr>
+        <w:pStyle w:val="Lijstopsomteken"/>
+      </w:pPr>
+      <w:r>
+        <w:t>Weather protection (louvre/hood) and any mesh reduce the net effective area, so the physical opening must be enlarged to preserve 0.03 m² net.</w:t>
+      </w:r>
+    </w:p>
+    <w:p>
+      <w:pPr>
+        <w:pStyle w:val="Kop2"/>
+      </w:pPr>
+      <w:r>
+        <w:t>7.2  Option 2 – G4 air filter (EN 779 / ISO 16890 coarse)</w:t>
+      </w:r>
+    </w:p>
+    <w:p>
+      <w:pPr/>
+      <w:r>
+        <w:t>A G4 coarse filter mounted in the vent keeps dust, dirt and insects out while still allowing gas exchange. Because a fibrous filter adds flow resistance, the vent face area must be enlarged so that the effective airflow keeps the hydrogen concentration below 1 %vol even when the filter is dirty (end of life).</w:t>
+      </w:r>
+    </w:p>
+    <w:p>
+      <w:pPr/>
+      <w:r>
+        <w:t>Researched filter resistance (typical G4 panel data):</w:t>
+      </w:r>
+    </w:p>
+    <w:p>
+      <w:pPr>
+        <w:pStyle w:val="Lijstopsomteken"/>
+      </w:pPr>
+      <w:r>
+        <w:t>Reference filter: a standard 592 × 592 mm G4 panel rated at ≈ 3400 m³/h (≈ 0.94 m³/s), i.e. a rated face velocity v_rated ≈ 2.7 m/s (representative Camfil / MANN+HUMMEL / AAF / Freudenberg data).</w:t>
+      </w:r>
+    </w:p>
+    <w:p>
+      <w:pPr>
+        <w:pStyle w:val="Lijstopsomteken"/>
+      </w:pPr>
+      <w:r>
+        <w:t>Clean (initial) pressure drop: ΔP_clean ≈ 45–65 Pa at v_rated; a value of 55 Pa is used.</w:t>
+      </w:r>
+    </w:p>
+    <w:p>
+      <w:pPr>
+        <w:pStyle w:val="Lijstopsomteken"/>
+      </w:pPr>
+      <w:r>
+        <w:t>Dirty / end-of-life pressure drop: ΔP_dirty = 250 Pa, the recommended final pressure drop for coarse/medium filters in EN 779:2012.</w:t>
+      </w:r>
+    </w:p>
+    <w:p>
+      <w:pPr/>
+      <w:r>
+        <w:t>Filter resistance model. At the low velocities of passive venting the filter behaves as a viscous (Darcy) resistance, ΔP_filter = k_f·v, where v = Q/A_f is the face velocity and A_f the filter face area. From the datasheet points: k_clean = 55 Pa / 2.7 m/s ≈ 20 Pa·s/m and k_dirty = 250 Pa / 2.7 m/s ≈ 93 Pa·s/m.</w:t>
+      </w:r>
+    </w:p>
+    <w:p>
+      <w:pPr/>
+      <w:r>
+        <w:t>Combined flow path. The filter is placed in series with the opening, so the driving pressure splits between the orifice loss and the filter loss: ΔP = (ρ/2)·(v/C_d)² + k_f·v. For a given ΔP this quadratic is solved for the face velocity v, giving the flow Q = v·A_f. This resistance is inserted into the validated time-stepping model in place of the plain orifice, and the minimum filter face area that keeps the peak hydrogen concentration below 1 %vol is found for the clean and the dirty condition. Setting k_f = 0 reproduces the open-vent threshold of 0.028 m² (Section 6), which validates the extended model.</w:t>
+      </w:r>
+    </w:p>
+    <w:p>
+      <w:pPr/>
+      <w:r>
+        <w:t>Calculated required filter face area:</w:t>
+      </w:r>
+    </w:p>
+    <w:p>
+      <w:pPr>
+        <w:pStyle w:val="Lijstopsomteken"/>
+      </w:pPr>
+      <w:r>
+        <w:t>Clean filter (k_f ≈ 20 Pa·s/m): A_f ≥ 0.078 m² (Ø ≈ 314 mm).</w:t>
+      </w:r>
+    </w:p>
+    <w:p>
+      <w:pPr>
+        <w:pStyle w:val="Lijstopsomteken"/>
+      </w:pPr>
+      <w:r>
+        <w:t>Dirty / end-of-life filter (k_f ≈ 93 Pa·s/m, worst case, governs): A_f ≥ 0.193 m² (Ø ≈ 496 mm).</w:t>
+      </w:r>
+    </w:p>
+    <w:p>
+      <w:pPr/>
+      <w:r>
+        <w:t>Safety factor. A safety factor of 1.5 is recommended on the end-of-life area to cover manufacturing tolerance, non-uniform dust loading and local blockage, hydrogen stratification, and the spread in published filter data: A_f,design = 1.5 × 0.193 ≈ 0.29 m².</w:t>
+      </w:r>
+    </w:p>
+    <w:p>
+      <w:pPr/>
+      <w:r>
+        <w:t>Practical selection. One standard 592 × 592 mm G4 panel provides ≈ 0.30 m² of net media face (Ø-equivalent ≈ 0.62 m), which satisfies the requirement. At this size the peak face velocity is only ≈ 0.84 m/s when dirty and ≈ 3.2 m/s when clean, and the model gives a peak hydrogen concentration of 0.73 %vol (dirty) and 0.31 %vol (clean) – both comfortably below the 1 %vol limit.</w:t>
+      </w:r>
+    </w:p>
+    <w:p>
+      <w:pPr>
+        <w:pStyle w:val="Bijschrift"/>
+      </w:pPr>
+      <w:r>
+        <w:t>Table 7  G4 filter sizing (series orifice + Darcy-resistance model).</w:t>
+      </w:r>
+    </w:p>
+    <w:tbl>
+      <w:tblPr>
+        <w:tblStyle w:val="Tabelraster"/>
+        <w:tblW w:type="auto" w:w="0"/>
+        <w:tblLook w:firstColumn="1" w:firstRow="1" w:lastColumn="0" w:lastRow="0" w:noHBand="0" w:noVBand="1" w:val="04A0"/>
+      </w:tblPr>
+      <w:tblGrid>
+        <w:gridCol w:w="1728"/>
+        <w:gridCol w:w="1728"/>
+        <w:gridCol w:w="1728"/>
+        <w:gridCol w:w="1728"/>
+        <w:gridCol w:w="1728"/>
+      </w:tblGrid>
+      <w:tr>
+        <w:tc>
+          <w:tcPr>
+            <w:tcW w:type="dxa" w:w="1728"/>
+          </w:tcPr>
+          <w:p>
+            <w:r>
+              <w:t>Condition</w:t>
+            </w:r>
+          </w:p>
+        </w:tc>
+        <w:tc>
+          <w:tcPr>
+            <w:tcW w:type="dxa" w:w="1728"/>
+          </w:tcPr>
+          <w:p>
+            <w:r>
+              <w:t>Required net face area [m²]</w:t>
+            </w:r>
+          </w:p>
+        </w:tc>
+        <w:tc>
+          <w:tcPr>
+            <w:tcW w:type="dxa" w:w="1728"/>
+          </w:tcPr>
+          <w:p>
+            <w:r>
+              <w:t>Equivalent diameter [mm]</w:t>
+            </w:r>
+          </w:p>
+        </w:tc>
+        <w:tc>
+          <w:tcPr>
+            <w:tcW w:type="dxa" w:w="1728"/>
+          </w:tcPr>
+          <w:p>
+            <w:r>
+              <w:t>Peak face velocity [m/s]</w:t>
+            </w:r>
+          </w:p>
+        </w:tc>
+        <w:tc>
+          <w:tcPr>
+            <w:tcW w:type="dxa" w:w="1728"/>
+          </w:tcPr>
+          <w:p>
+            <w:r>
+              <w:t>Peak H₂ concentration [%vol]</w:t>
+            </w:r>
+          </w:p>
+        </w:tc>
+      </w:tr>
+      <w:tr>
+        <w:tc>
+          <w:tcPr>
+            <w:tcW w:type="dxa" w:w="1728"/>
+          </w:tcPr>
+          <w:p>
+            <w:r>
+              <w:t>Clean (initial), k_f ≈ 20 Pa·s/m</w:t>
+            </w:r>
+          </w:p>
+        </w:tc>
+        <w:tc>
+          <w:tcPr>
+            <w:tcW w:type="dxa" w:w="1728"/>
+          </w:tcPr>
+          <w:p>
+            <w:r>
+              <w:t>0.078</w:t>
+            </w:r>
+          </w:p>
+        </w:tc>
+        <w:tc>
+          <w:tcPr>
+            <w:tcW w:type="dxa" w:w="1728"/>
+          </w:tcPr>
+          <w:p>
+            <w:r>
+              <w:t>314</w:t>
+            </w:r>
+          </w:p>
+        </w:tc>
+        <w:tc>
+          <w:tcPr>
+            <w:tcW w:type="dxa" w:w="1728"/>
+          </w:tcPr>
+          <w:p>
+            <w:r>
+              <w:t>3.16</w:t>
+            </w:r>
+          </w:p>
+        </w:tc>
+        <w:tc>
+          <w:tcPr>
+            <w:tcW w:type="dxa" w:w="1728"/>
+          </w:tcPr>
+          <w:p>
+            <w:r>
+              <w:t>1.00</w:t>
+            </w:r>
+          </w:p>
+        </w:tc>
+      </w:tr>
+      <w:tr>
+        <w:tc>
+          <w:tcPr>
+            <w:tcW w:type="dxa" w:w="1728"/>
+          </w:tcPr>
+          <w:p>
+            <w:r>
+              <w:t>Dirty / end-of-life, k_f ≈ 93 Pa·s/m (governs)</w:t>
+            </w:r>
+          </w:p>
+        </w:tc>
+        <w:tc>
+          <w:tcPr>
+            <w:tcW w:type="dxa" w:w="1728"/>
+          </w:tcPr>
+          <w:p>
+            <w:r>
+              <w:t>0.193</w:t>
+            </w:r>
+          </w:p>
+        </w:tc>
+        <w:tc>
+          <w:tcPr>
+            <w:tcW w:type="dxa" w:w="1728"/>
+          </w:tcPr>
+          <w:p>
+            <w:r>
+              <w:t>496</w:t>
+            </w:r>
+          </w:p>
+        </w:tc>
+        <w:tc>
+          <w:tcPr>
+            <w:tcW w:type="dxa" w:w="1728"/>
+          </w:tcPr>
+          <w:p>
+            <w:r>
+              <w:t>0.84</w:t>
+            </w:r>
+          </w:p>
+        </w:tc>
+        <w:tc>
+          <w:tcPr>
+            <w:tcW w:type="dxa" w:w="1728"/>
+          </w:tcPr>
+          <w:p>
+            <w:r>
+              <w:t>1.00</w:t>
+            </w:r>
+          </w:p>
+        </w:tc>
+      </w:tr>
+      <w:tr>
+        <w:tc>
+          <w:tcPr>
+            <w:tcW w:type="dxa" w:w="1728"/>
+          </w:tcPr>
+          <w:p>
+            <w:r>
+              <w:t>Recommended design (0.30 m², SF = 1.5 on EOL)</w:t>
+            </w:r>
+          </w:p>
+        </w:tc>
+        <w:tc>
+          <w:tcPr>
+            <w:tcW w:type="dxa" w:w="1728"/>
+          </w:tcPr>
+          <w:p>
+            <w:r>
+              <w:t>0.30</w:t>
+            </w:r>
+          </w:p>
+        </w:tc>
+        <w:tc>
+          <w:tcPr>
+            <w:tcW w:type="dxa" w:w="1728"/>
+          </w:tcPr>
+          <w:p>
+            <w:r>
+              <w:t>618</w:t>
+            </w:r>
+          </w:p>
+        </w:tc>
+        <w:tc>
+          <w:tcPr>
+            <w:tcW w:type="dxa" w:w="1728"/>
+          </w:tcPr>
+          <w:p>
+            <w:r>
+              <w:t>0.84 (dirty) / 3.16 (clean)</w:t>
+            </w:r>
+          </w:p>
+        </w:tc>
+        <w:tc>
+          <w:tcPr>
+            <w:tcW w:type="dxa" w:w="1728"/>
+          </w:tcPr>
+          <w:p>
+            <w:r>
+              <w:t>0.73 (dirty) / 0.31 (clean)</w:t>
+            </w:r>
+          </w:p>
+        </w:tc>
+      </w:tr>
+    </w:tbl>
+    <w:p>
+      <w:pPr/>
+    </w:p>
+    <w:p>
+      <w:pPr/>
+      <w:r>
+        <w:t>Key assumptions for Option 2:</w:t>
+      </w:r>
+    </w:p>
+    <w:p>
+      <w:pPr>
+        <w:pStyle w:val="Lijstopsomteken"/>
+      </w:pPr>
+      <w:r>
+        <w:t>Filter pressure drop is linear in face velocity (Darcy regime), valid at the low velocities involved.</w:t>
+      </w:r>
+    </w:p>
+    <w:p>
+      <w:pPr>
+        <w:pStyle w:val="Lijstopsomteken"/>
+      </w:pPr>
+      <w:r>
+        <w:t>Filter and opening act in series; the diffusive exchange term k_diff·A is retained on the filter face (a conservative treatment, since a loaded filter would further suppress it, but diffusion does not govern the peak).</w:t>
+      </w:r>
+    </w:p>
+    <w:p>
+      <w:pPr>
+        <w:pStyle w:val="Lijstopsomteken"/>
+      </w:pPr>
+      <w:r>
+        <w:t>End-of-life resistance equals the EN 779 recommended final pressure drop of 250 Pa.</w:t>
+      </w:r>
+    </w:p>
+    <w:p>
+      <w:pPr>
+        <w:pStyle w:val="Lijstopsomteken"/>
+      </w:pPr>
+      <w:r>
+        <w:t>Clean and end-of-life data are representative of the G4 class; the selected product datasheet should be confirmed.</w:t>
+      </w:r>
+    </w:p>
+    <w:p>
+      <w:pPr/>
+      <w:r>
+        <w:t>Advantages of Option 2:</w:t>
+      </w:r>
+    </w:p>
+    <w:p>
+      <w:pPr>
+        <w:pStyle w:val="Lijstopsomteken"/>
+      </w:pPr>
+      <w:r>
+        <w:t>Keeps out dust, dirt and insects, and (with a hood) protects against splashing water.</w:t>
+      </w:r>
+    </w:p>
+    <w:p>
+      <w:pPr>
+        <w:pStyle w:val="Lijstopsomteken"/>
+      </w:pPr>
+      <w:r>
+        <w:t>Fully passive – no moving parts and no power required.</w:t>
+      </w:r>
+    </w:p>
+    <w:p>
+      <w:pPr>
+        <w:pStyle w:val="Lijstopsomteken"/>
+      </w:pPr>
+      <w:r>
+        <w:t>Maintains a defined, verifiable net area when serviced; loading can be monitored via a ΔP gauge or loading indicator.</w:t>
+      </w:r>
+    </w:p>
+    <w:p>
+      <w:pPr/>
+      <w:r>
+        <w:t>Disadvantages of Option 2:</w:t>
+      </w:r>
+    </w:p>
+    <w:p>
+      <w:pPr>
+        <w:pStyle w:val="Lijstopsomteken"/>
+      </w:pPr>
+      <w:r>
+        <w:t>Much larger face area than the open vent (≈ 0.30 m², roughly 10× the 0.03 m² open area).</w:t>
+      </w:r>
+    </w:p>
+    <w:p>
+      <w:pPr>
+        <w:pStyle w:val="Lijstopsomteken"/>
+      </w:pPr>
+      <w:r>
+        <w:t>Resistance rises as the filter loads, so it must be sized on the end-of-life condition.</w:t>
+      </w:r>
+    </w:p>
+    <w:p>
+      <w:pPr>
+        <w:pStyle w:val="Lijstopsomteken"/>
+      </w:pPr>
+      <w:r>
+        <w:t>Requires periodic inspection and replacement (recurring maintenance and cost).</w:t>
+      </w:r>
+    </w:p>
+    <w:p>
+      <w:pPr>
+        <w:pStyle w:val="Lijstopsomteken"/>
+      </w:pPr>
+      <w:r>
+        <w:t>Can blind with water or ice and lose venting capacity if not weather-protected and drained.</w:t>
+      </w:r>
+    </w:p>
+    <w:p>
+      <w:pPr>
+        <w:pStyle w:val="Lijstopsomteken"/>
+      </w:pPr>
+      <w:r>
+        <w:t>Standard media is combustible; an inorganic / metal-media G4 element is preferred near a BESS, and the filter is not a flame arrestor.</w:t>
+      </w:r>
+    </w:p>
+    <w:p>
+      <w:pPr>
+        <w:pStyle w:val="Kop2"/>
+      </w:pPr>
+      <w:r>
+        <w:t>7.3  Option 3 – Overpressure (pressure-relief) valve</w:t>
+      </w:r>
+    </w:p>
+    <w:p>
+      <w:pPr/>
+      <w:r>
+        <w:t>An overpressure relief valve is a spring-, weight- or magnet-loaded flap or poppet that stays closed – sealing the enclosure against dust and water – until the internal pressure exceeds a set cracking pressure, at which point it lifts to vent and then recloses when the pressure falls. When shut it can provide an IP-rated seal, giving the best ingress protection of the three options. Such valves and vent dampers are used on BESS enclosures for overpressure and deflagration relief (NFPA 68 / EN 14994; see also NFPA 855 and IEC 62933-5-2).</w:t>
+      </w:r>
+    </w:p>
+    <w:p>
+      <w:pPr/>
+      <w:r>
+        <w:t>Typical opening (cracking) pressures:</w:t>
+      </w:r>
+    </w:p>
+    <w:p>
+      <w:pPr>
+        <w:pStyle w:val="Lijstopsomteken"/>
+      </w:pPr>
+      <w:r>
+        <w:t>Low-pressure tank / enclosure relief valves: ≈ 5–70 mbar (≈ 500–7000 Pa) – e.g. API 2000 / EN ISO 28300 practice.</w:t>
+      </w:r>
+    </w:p>
+    <w:p>
+      <w:pPr>
+        <w:pStyle w:val="Lijstopsomteken"/>
+      </w:pPr>
+      <w:r>
+        <w:t>Explosion-relief panels / dampers for BESS enclosures: commonly ≈ 10–100 mbar (≈ 1–10 kPa).</w:t>
+      </w:r>
+    </w:p>
+    <w:p>
+      <w:pPr/>
+      <w:r>
+        <w:t>When it opens during this release. The valve opens only once the internal pressure exceeds its set point. In this event the open-vent pressure is only ≈ 79 Pa, and even the fully sealed container peaks at 10.42 kPa (Section 6). A valve set at any realistic value (several hundred Pa or more) therefore stays shut during the low-pressure dilution phase, when venting is most needed.</w:t>
+      </w:r>
+    </w:p>
+    <w:p>
+      <w:pPr/>
+      <w:r>
+        <w:t>Capacity check. The validated model was re-run with the valve represented as an orifice that flows only while ΔP exceeds the cracking pressure P_crack. The results show that the hydrogen limit is met only for an unrealistically low set point combined with a large valve, and is otherwise exceeded by a factor of about two to three:</w:t>
+      </w:r>
+    </w:p>
+    <w:p>
+      <w:pPr>
+        <w:pStyle w:val="Bijschrift"/>
+      </w:pPr>
+      <w:r>
+        <w:t>Table 8  Overpressure-valve capacity check (valve flows only while ΔP &gt; P_crack).</w:t>
+      </w:r>
+    </w:p>
+    <w:tbl>
+      <w:tblPr>
+        <w:tblStyle w:val="Tabelraster"/>
+        <w:tblW w:type="auto" w:w="0"/>
+        <w:tblLook w:firstColumn="1" w:firstRow="1" w:lastColumn="0" w:lastRow="0" w:noHBand="0" w:noVBand="1" w:val="04A0"/>
+      </w:tblPr>
+      <w:tblGrid>
+        <w:gridCol w:w="2160"/>
+        <w:gridCol w:w="2160"/>
+        <w:gridCol w:w="2160"/>
+        <w:gridCol w:w="2160"/>
+      </w:tblGrid>
+      <w:tr>
+        <w:tc>
+          <w:tcPr>
+            <w:tcW w:type="dxa" w:w="2160"/>
+          </w:tcPr>
+          <w:p>
+            <w:r>
+              <w:t>Cracking pressure P_crack [Pa]</w:t>
+            </w:r>
+          </w:p>
+        </w:tc>
+        <w:tc>
+          <w:tcPr>
+            <w:tcW w:type="dxa" w:w="2160"/>
+          </w:tcPr>
+          <w:p>
+            <w:r>
+              <w:t>Valve open area [m²]</w:t>
+            </w:r>
+          </w:p>
+        </w:tc>
+        <w:tc>
+          <w:tcPr>
+            <w:tcW w:type="dxa" w:w="2160"/>
+          </w:tcPr>
+          <w:p>
+            <w:r>
+              <w:t>Peak H₂ concentration [%vol]</w:t>
+            </w:r>
+          </w:p>
+        </w:tc>
+        <w:tc>
+          <w:tcPr>
+            <w:tcW w:type="dxa" w:w="2160"/>
+          </w:tcPr>
+          <w:p>
+            <w:r>
+              <w:t>Peak internal pressure rise [Pa]</w:t>
+            </w:r>
+          </w:p>
+        </w:tc>
+      </w:tr>
+      <w:tr>
+        <w:tc>
+          <w:tcPr>
+            <w:tcW w:type="dxa" w:w="2160"/>
+          </w:tcPr>
+          <w:p>
+            <w:r>
+              <w:t>100</w:t>
+            </w:r>
+          </w:p>
+        </w:tc>
+        <w:tc>
+          <w:tcPr>
+            <w:tcW w:type="dxa" w:w="2160"/>
+          </w:tcPr>
+          <w:p>
+            <w:r>
+              <w:t>0.10</w:t>
+            </w:r>
+          </w:p>
+        </w:tc>
+        <w:tc>
+          <w:tcPr>
+            <w:tcW w:type="dxa" w:w="2160"/>
+          </w:tcPr>
+          <w:p>
+            <w:r>
+              <w:t>0.95</w:t>
+            </w:r>
+          </w:p>
+        </w:tc>
+        <w:tc>
+          <w:tcPr>
+            <w:tcW w:type="dxa" w:w="2160"/>
+          </w:tcPr>
+          <w:p>
+            <w:r>
+              <w:t>157</w:t>
+            </w:r>
+          </w:p>
+        </w:tc>
+      </w:tr>
+      <w:tr>
+        <w:tc>
+          <w:tcPr>
+            <w:tcW w:type="dxa" w:w="2160"/>
+          </w:tcPr>
+          <w:p>
+            <w:r>
+              <w:t>200</w:t>
+            </w:r>
+          </w:p>
+        </w:tc>
+        <w:tc>
+          <w:tcPr>
+            <w:tcW w:type="dxa" w:w="2160"/>
+          </w:tcPr>
+          <w:p>
+            <w:r>
+              <w:t>0.03</w:t>
+            </w:r>
+          </w:p>
+        </w:tc>
+        <w:tc>
+          <w:tcPr>
+            <w:tcW w:type="dxa" w:w="2160"/>
+          </w:tcPr>
+          <w:p>
+            <w:r>
+              <w:t>2.38</w:t>
+            </w:r>
+          </w:p>
+        </w:tc>
+        <w:tc>
+          <w:tcPr>
+            <w:tcW w:type="dxa" w:w="2160"/>
+          </w:tcPr>
+          <w:p>
+            <w:r>
+              <w:t>263</w:t>
+            </w:r>
+          </w:p>
+        </w:tc>
+      </w:tr>
+      <w:tr>
+        <w:tc>
+          <w:tcPr>
+            <w:tcW w:type="dxa" w:w="2160"/>
+          </w:tcPr>
+          <w:p>
+            <w:r>
+              <w:t>500</w:t>
+            </w:r>
+          </w:p>
+        </w:tc>
+        <w:tc>
+          <w:tcPr>
+            <w:tcW w:type="dxa" w:w="2160"/>
+          </w:tcPr>
+          <w:p>
+            <w:r>
+              <w:t>0.03</w:t>
+            </w:r>
+          </w:p>
+        </w:tc>
+        <w:tc>
+          <w:tcPr>
+            <w:tcW w:type="dxa" w:w="2160"/>
+          </w:tcPr>
+          <w:p>
+            <w:r>
+              <w:t>2.66</w:t>
+            </w:r>
+          </w:p>
+        </w:tc>
+        <w:tc>
+          <w:tcPr>
+            <w:tcW w:type="dxa" w:w="2160"/>
+          </w:tcPr>
+          <w:p>
+            <w:r>
+              <w:t>575</w:t>
+            </w:r>
+          </w:p>
+        </w:tc>
+      </w:tr>
+      <w:tr>
+        <w:tc>
+          <w:tcPr>
+            <w:tcW w:type="dxa" w:w="2160"/>
+          </w:tcPr>
+          <w:p>
+            <w:r>
+              <w:t>1000</w:t>
+            </w:r>
+          </w:p>
+        </w:tc>
+        <w:tc>
+          <w:tcPr>
+            <w:tcW w:type="dxa" w:w="2160"/>
+          </w:tcPr>
+          <w:p>
+            <w:r>
+              <w:t>0.03</w:t>
+            </w:r>
+          </w:p>
+        </w:tc>
+        <w:tc>
+          <w:tcPr>
+            <w:tcW w:type="dxa" w:w="2160"/>
+          </w:tcPr>
+          <w:p>
+            <w:r>
+              <w:t>2.84</w:t>
+            </w:r>
+          </w:p>
+        </w:tc>
+        <w:tc>
+          <w:tcPr>
+            <w:tcW w:type="dxa" w:w="2160"/>
+          </w:tcPr>
+          <w:p>
+            <w:r>
+              <w:t>1050</w:t>
+            </w:r>
+          </w:p>
+        </w:tc>
+      </w:tr>
+      <w:tr>
+        <w:tc>
+          <w:tcPr>
+            <w:tcW w:type="dxa" w:w="2160"/>
+          </w:tcPr>
+          <w:p>
+            <w:r>
+              <w:t>5000</w:t>
+            </w:r>
+          </w:p>
+        </w:tc>
+        <w:tc>
+          <w:tcPr>
+            <w:tcW w:type="dxa" w:w="2160"/>
+          </w:tcPr>
+          <w:p>
+            <w:r>
+              <w:t>0.03</w:t>
+            </w:r>
+          </w:p>
+        </w:tc>
+        <w:tc>
+          <w:tcPr>
+            <w:tcW w:type="dxa" w:w="2160"/>
+          </w:tcPr>
+          <w:p>
+            <w:r>
+              <w:t>2.89</w:t>
+            </w:r>
+          </w:p>
+        </w:tc>
+        <w:tc>
+          <w:tcPr>
+            <w:tcW w:type="dxa" w:w="2160"/>
+          </w:tcPr>
+          <w:p>
+            <w:r>
+              <w:t>5039</w:t>
+            </w:r>
+          </w:p>
+        </w:tc>
+      </w:tr>
+    </w:tbl>
+    <w:p>
+      <w:pPr/>
+    </w:p>
+    <w:p>
+      <w:pPr/>
+      <w:r>
+        <w:t>Interpretation. Because the thermal-runaway release is a low-pressure, dilution-limited event – not an overpressure event – a pressure-relief valve set at realistic cracking pressures does not open early enough to hold the hydrogen concentration below 1 %vol, and so cannot serve as the primary hydrogen-dilution vent. It is, however, well suited as supplementary deflagration / overpressure protection (sized per NFPA 68 / EN 14994) to protect the enclosure structure against a fast pressure rise, and it offers the best dust and water protection when shut. For that supplementary duty the valve does not govern: at the peak total-gas generation of only ≈ 6.3 L/s the modest ΔP is relieved by even a small valve.</w:t>
+      </w:r>
+    </w:p>
+    <w:p>
+      <w:pPr/>
+      <w:r>
+        <w:t>Advantages of Option 3:</w:t>
+      </w:r>
+    </w:p>
+    <w:p>
+      <w:pPr>
+        <w:pStyle w:val="Lijstopsomteken"/>
+      </w:pPr>
+      <w:r>
+        <w:t>Best protection against dust, insects and water – sealed (IP-rated) when closed, with no open path.</w:t>
+      </w:r>
+    </w:p>
+    <w:p>
+      <w:pPr>
+        <w:pStyle w:val="Lijstopsomteken"/>
+      </w:pPr>
+      <w:r>
+        <w:t>No filter media to replace; low routine maintenance (periodic function test only).</w:t>
+      </w:r>
+    </w:p>
+    <w:p>
+      <w:pPr>
+        <w:pStyle w:val="Lijstopsomteken"/>
+      </w:pPr>
+      <w:r>
+        <w:t>Recloses automatically; well suited to overpressure / deflagration protection of the enclosure.</w:t>
+      </w:r>
+    </w:p>
+    <w:p>
+      <w:pPr/>
+      <w:r>
+        <w:t>Disadvantages of Option 3:</w:t>
+      </w:r>
+    </w:p>
+    <w:p>
+      <w:pPr>
+        <w:pStyle w:val="Lijstopsomteken"/>
+      </w:pPr>
+      <w:r>
+        <w:t>Cracking pressure (hundreds of Pa to several kPa) far exceeds the ≈ 79 Pa the release generates.</w:t>
+      </w:r>
+    </w:p>
+    <w:p>
+      <w:pPr>
+        <w:pStyle w:val="Lijstopsomteken"/>
+      </w:pPr>
+      <w:r>
+        <w:t>Provides no venting until the set point is reached, so hydrogen exceeds 1 %vol – unsuitable as the sole/primary vent.</w:t>
+      </w:r>
+    </w:p>
+    <w:p>
+      <w:pPr>
+        <w:pStyle w:val="Lijstopsomteken"/>
+      </w:pPr>
+      <w:r>
+        <w:t>Has moving parts that can stick or corrode and fail to open, so periodic testing is required.</w:t>
+      </w:r>
+    </w:p>
+    <w:p>
+      <w:pPr>
+        <w:pStyle w:val="Kop2"/>
+      </w:pPr>
+      <w:r>
+        <w:t>7.4  Comparison and final recommendation</w:t>
+      </w:r>
+    </w:p>
+    <w:p>
+      <w:pPr/>
+      <w:r>
+        <w:t>Table 9 compares the three options against the criteria relevant to the e-PU10 container. The open vent defines the minimum area and the lowest resistance; the G4 filter meets the hydrogen limit while protecting against ingress; the overpressure valve protects against ingress but cannot meet the hydrogen limit on its own.</w:t>
+      </w:r>
+    </w:p>
+    <w:p>
+      <w:pPr>
+        <w:pStyle w:val="Bijschrift"/>
+      </w:pPr>
+      <w:r>
+        <w:t>Table 9  Comparison of the three venting solutions for the e-PU10 container.</w:t>
+      </w:r>
+    </w:p>
+    <w:tbl>
+      <w:tblPr>
+        <w:tblStyle w:val="Tabelraster"/>
+        <w:tblW w:type="auto" w:w="0"/>
+        <w:tblLook w:firstColumn="1" w:firstRow="1" w:lastColumn="0" w:lastRow="0" w:noHBand="0" w:noVBand="1" w:val="04A0"/>
+      </w:tblPr>
+      <w:tblGrid>
+        <w:gridCol w:w="2160"/>
+        <w:gridCol w:w="2160"/>
+        <w:gridCol w:w="2160"/>
+        <w:gridCol w:w="2160"/>
+      </w:tblGrid>
+      <w:tr>
+        <w:tc>
+          <w:tcPr>
+            <w:tcW w:type="dxa" w:w="2160"/>
+          </w:tcPr>
+          <w:p>
+            <w:r>
+              <w:t>Criterion</w:t>
+            </w:r>
+          </w:p>
+        </w:tc>
+        <w:tc>
+          <w:tcPr>
+            <w:tcW w:type="dxa" w:w="2160"/>
+          </w:tcPr>
+          <w:p>
+            <w:r>
+              <w:t>Option 1 – Open vent</w:t>
+            </w:r>
+          </w:p>
+        </w:tc>
+        <w:tc>
+          <w:tcPr>
+            <w:tcW w:type="dxa" w:w="2160"/>
+          </w:tcPr>
+          <w:p>
+            <w:r>
+              <w:t>Option 2 – G4 filter</w:t>
+            </w:r>
+          </w:p>
+        </w:tc>
+        <w:tc>
+          <w:tcPr>
+            <w:tcW w:type="dxa" w:w="2160"/>
+          </w:tcPr>
+          <w:p>
+            <w:r>
+              <w:t>Option 3 – Overpressure valve</w:t>
+            </w:r>
+          </w:p>
+        </w:tc>
+      </w:tr>
+      <w:tr>
+        <w:tc>
+          <w:tcPr>
+            <w:tcW w:type="dxa" w:w="2160"/>
+          </w:tcPr>
+          <w:p>
+            <w:r>
+              <w:t>Required size (net)</w:t>
+            </w:r>
+          </w:p>
+        </w:tc>
+        <w:tc>
+          <w:tcPr>
+            <w:tcW w:type="dxa" w:w="2160"/>
+          </w:tcPr>
+          <w:p>
+            <w:r>
+              <w:t>0.03 m² (Ø 195 mm); margin to 0.04 m²</w:t>
+            </w:r>
+          </w:p>
+        </w:tc>
+        <w:tc>
+          <w:tcPr>
+            <w:tcW w:type="dxa" w:w="2160"/>
+          </w:tcPr>
+          <w:p>
+            <w:r>
+              <w:t>≈ 0.30 m² net media (one 592×592 mm G4; SF 1.5 on 0.193 m² EOL)</w:t>
+            </w:r>
+          </w:p>
+        </w:tc>
+        <w:tc>
+          <w:tcPr>
+            <w:tcW w:type="dxa" w:w="2160"/>
+          </w:tcPr>
+          <w:p>
+            <w:r>
+              <w:t>n/a for dilution (set point ≫ 79 Pa)</w:t>
+            </w:r>
+          </w:p>
+        </w:tc>
+      </w:tr>
+      <w:tr>
+        <w:tc>
+          <w:tcPr>
+            <w:tcW w:type="dxa" w:w="2160"/>
+          </w:tcPr>
+          <w:p>
+            <w:r>
+              <w:t>Airflow resistance</w:t>
+            </w:r>
+          </w:p>
+        </w:tc>
+        <w:tc>
+          <w:tcPr>
+            <w:tcW w:type="dxa" w:w="2160"/>
+          </w:tcPr>
+          <w:p>
+            <w:r>
+              <w:t>Lowest (orifice only, ≈ 79 Pa peak)</w:t>
+            </w:r>
+          </w:p>
+        </w:tc>
+        <w:tc>
+          <w:tcPr>
+            <w:tcW w:type="dxa" w:w="2160"/>
+          </w:tcPr>
+          <w:p>
+            <w:r>
+              <w:t>Moderate–high; rises with loading, sized for 250 Pa EOL</w:t>
+            </w:r>
+          </w:p>
+        </w:tc>
+        <w:tc>
+          <w:tcPr>
+            <w:tcW w:type="dxa" w:w="2160"/>
+          </w:tcPr>
+          <w:p>
+            <w:r>
+              <w:t>Very high until cracked; then low</w:t>
+            </w:r>
+          </w:p>
+        </w:tc>
+      </w:tr>
+      <w:tr>
+        <w:tc>
+          <w:tcPr>
+            <w:tcW w:type="dxa" w:w="2160"/>
+          </w:tcPr>
+          <w:p>
+            <w:r>
+              <w:t>Hydrogen safety (peak C_H2)</w:t>
+            </w:r>
+          </w:p>
+        </w:tc>
+        <w:tc>
+          <w:tcPr>
+            <w:tcW w:type="dxa" w:w="2160"/>
+          </w:tcPr>
+          <w:p>
+            <w:r>
+              <w:t>0.93 %vol – PASS</w:t>
+            </w:r>
+          </w:p>
+        </w:tc>
+        <w:tc>
+          <w:tcPr>
+            <w:tcW w:type="dxa" w:w="2160"/>
+          </w:tcPr>
+          <w:p>
+            <w:r>
+              <w:t>0.73 %vol dirty / 0.31 %vol clean – PASS</w:t>
+            </w:r>
+          </w:p>
+        </w:tc>
+        <w:tc>
+          <w:tcPr>
+            <w:tcW w:type="dxa" w:w="2160"/>
+          </w:tcPr>
+          <w:p>
+            <w:r>
+              <w:t>2.1–2.8 %vol – FAIL as primary vent</w:t>
+            </w:r>
+          </w:p>
+        </w:tc>
+      </w:tr>
+      <w:tr>
+        <w:tc>
+          <w:tcPr>
+            <w:tcW w:type="dxa" w:w="2160"/>
+          </w:tcPr>
+          <w:p>
+            <w:r>
+              <w:t>Dust / water protection</w:t>
+            </w:r>
+          </w:p>
+        </w:tc>
+        <w:tc>
+          <w:tcPr>
+            <w:tcW w:type="dxa" w:w="2160"/>
+          </w:tcPr>
+          <w:p>
+            <w:r>
+              <w:t>None (needs louvre / hood)</w:t>
+            </w:r>
+          </w:p>
+        </w:tc>
+        <w:tc>
+          <w:tcPr>
+            <w:tcW w:type="dxa" w:w="2160"/>
+          </w:tcPr>
+          <w:p>
+            <w:r>
+              <w:t>Good dust &amp; insect + splash (with hood)</w:t>
+            </w:r>
+          </w:p>
+        </w:tc>
+        <w:tc>
+          <w:tcPr>
+            <w:tcW w:type="dxa" w:w="2160"/>
+          </w:tcPr>
+          <w:p>
+            <w:r>
+              <w:t>Best (sealed when closed)</w:t>
+            </w:r>
+          </w:p>
+        </w:tc>
+      </w:tr>
+      <w:tr>
+        <w:tc>
+          <w:tcPr>
+            <w:tcW w:type="dxa" w:w="2160"/>
+          </w:tcPr>
+          <w:p>
+            <w:r>
+              <w:t>Maintenance</w:t>
+            </w:r>
+          </w:p>
+        </w:tc>
+        <w:tc>
+          <w:tcPr>
+            <w:tcW w:type="dxa" w:w="2160"/>
+          </w:tcPr>
+          <w:p>
+            <w:r>
+              <w:t>Effectively none</w:t>
+            </w:r>
+          </w:p>
+        </w:tc>
+        <w:tc>
+          <w:tcPr>
+            <w:tcW w:type="dxa" w:w="2160"/>
+          </w:tcPr>
+          <w:p>
+            <w:r>
+              <w:t>Periodic inspection / replacement</w:t>
+            </w:r>
+          </w:p>
+        </w:tc>
+        <w:tc>
+          <w:tcPr>
+            <w:tcW w:type="dxa" w:w="2160"/>
+          </w:tcPr>
+          <w:p>
+            <w:r>
+              <w:t>Periodic function test</w:t>
+            </w:r>
+          </w:p>
+        </w:tc>
+      </w:tr>
+      <w:tr>
+        <w:tc>
+          <w:tcPr>
+            <w:tcW w:type="dxa" w:w="2160"/>
+          </w:tcPr>
+          <w:p>
+            <w:r>
+              <w:t>Reliability</w:t>
+            </w:r>
+          </w:p>
+        </w:tc>
+        <w:tc>
+          <w:tcPr>
+            <w:tcW w:type="dxa" w:w="2160"/>
+          </w:tcPr>
+          <w:p>
+            <w:r>
+              <w:t>Highest (no moving parts)</w:t>
+            </w:r>
+          </w:p>
+        </w:tc>
+        <w:tc>
+          <w:tcPr>
+            <w:tcW w:type="dxa" w:w="2160"/>
+          </w:tcPr>
+          <w:p>
+            <w:r>
+              <w:t>High if serviced; degrades as it loads</w:t>
+            </w:r>
+          </w:p>
+        </w:tc>
+        <w:tc>
+          <w:tcPr>
+            <w:tcW w:type="dxa" w:w="2160"/>
+          </w:tcPr>
+          <w:p>
+            <w:r>
+              <w:t>Mechanical parts can stick / fail to open</w:t>
+            </w:r>
+          </w:p>
+        </w:tc>
+      </w:tr>
+      <w:tr>
+        <w:tc>
+          <w:tcPr>
+            <w:tcW w:type="dxa" w:w="2160"/>
+          </w:tcPr>
+          <w:p>
+            <w:r>
+              <w:t>Cost implications</w:t>
+            </w:r>
+          </w:p>
+        </w:tc>
+        <w:tc>
+          <w:tcPr>
+            <w:tcW w:type="dxa" w:w="2160"/>
+          </w:tcPr>
+          <w:p>
+            <w:r>
+              <w:t>Lowest</w:t>
+            </w:r>
+          </w:p>
+        </w:tc>
+        <w:tc>
+          <w:tcPr>
+            <w:tcW w:type="dxa" w:w="2160"/>
+          </w:tcPr>
+          <w:p>
+            <w:r>
+              <w:t>Moderate (filter, housing, servicing)</w:t>
+            </w:r>
+          </w:p>
+        </w:tc>
+        <w:tc>
+          <w:tcPr>
+            <w:tcW w:type="dxa" w:w="2160"/>
+          </w:tcPr>
+          <w:p>
+            <w:r>
+              <w:t>Moderate (mechanical device)</w:t>
+            </w:r>
+          </w:p>
+        </w:tc>
+      </w:tr>
+      <w:tr>
+        <w:tc>
+          <w:tcPr>
+            <w:tcW w:type="dxa" w:w="2160"/>
+          </w:tcPr>
+          <w:p>
+            <w:r>
+              <w:t>Suitability for e-PU10</w:t>
+            </w:r>
+          </w:p>
+        </w:tc>
+        <w:tc>
+          <w:tcPr>
+            <w:tcW w:type="dxa" w:w="2160"/>
+          </w:tcPr>
+          <w:p>
+            <w:r>
+              <w:t>Meets safety but poor ingress protection</w:t>
+            </w:r>
+          </w:p>
+        </w:tc>
+        <w:tc>
+          <w:tcPr>
+            <w:tcW w:type="dxa" w:w="2160"/>
+          </w:tcPr>
+          <w:p>
+            <w:r>
+              <w:t>Recommended primary solution</w:t>
+            </w:r>
+          </w:p>
+        </w:tc>
+        <w:tc>
+          <w:tcPr>
+            <w:tcW w:type="dxa" w:w="2160"/>
+          </w:tcPr>
+          <w:p>
+            <w:r>
+              <w:t>Supplementary overpressure / deflagration device only</w:t>
+            </w:r>
+          </w:p>
+        </w:tc>
+      </w:tr>
+    </w:tbl>
+    <w:p>
+      <w:pPr/>
+    </w:p>
+    <w:p>
+      <w:pPr/>
+      <w:r>
+        <w:t>Engineering recommendation.</w:t>
+      </w:r>
+    </w:p>
+    <w:p>
+      <w:pPr>
+        <w:pStyle w:val="Lijstopsomteken"/>
+      </w:pPr>
+      <w:r>
+        <w:t>Adopt a G4-filtered passive vent as the primary solution: a high-mounted, weather-hooded G4 (EN 779 / ISO 16890 coarse) filter panel with a net media face area of at least 0.29 m² – conveniently one standard 592 × 592 mm G4 panel (≈ 0.30 m² net) – sized on the end-of-life (250 Pa) resistance with a 1.5 safety factor. This holds the peak hydrogen concentration at ≈ 0.73 %vol even with a fully loaded filter while protecting the container against dust, dirt, insects and splashing water.</w:t>
+      </w:r>
+    </w:p>
+    <w:p>
+      <w:pPr>
+        <w:pStyle w:val="Lijstopsomteken"/>
+      </w:pPr>
+      <w:r>
+        <w:t>The open 0.03 m² vent remains the reference minimum net free area and the lowest-resistance option, but is not recommended for service use because it offers no ingress protection.</w:t>
+      </w:r>
+    </w:p>
+    <w:p>
+      <w:pPr>
+        <w:pStyle w:val="Lijstopsomteken"/>
+      </w:pPr>
+      <w:r>
+        <w:t>A pressure-relief / overpressure valve is not suitable as the primary vent, because its cracking pressure (hundreds of Pa to several kPa) greatly exceeds the ≈ 79 Pa generated by the release; it would not open in time to hold the 1 %vol limit. It is recommended only as a supplementary deflagration / overpressure device (NFPA 68 / EN 14994) and for its superior sealing when closed.</w:t>
+      </w:r>
+    </w:p>
+    <w:p>
+      <w:pPr/>
+      <w:r>
+        <w:t>Implementation notes:</w:t>
+      </w:r>
+    </w:p>
+    <w:p>
+      <w:pPr>
+        <w:pStyle w:val="Lijstopsomteken"/>
+      </w:pPr>
+      <w:r>
+        <w:t>Mount the vent high on the enclosure (hydrogen is buoyant) and fit a downward-facing weather hood with drainage.</w:t>
+      </w:r>
+    </w:p>
+    <w:p>
+      <w:pPr>
+        <w:pStyle w:val="Lijstopsomteken"/>
+      </w:pPr>
+      <w:r>
+        <w:t>Prefer inorganic / metal (non-combustible) G4 media near the BESS and add a flame arrestor at the opening.</w:t>
+      </w:r>
+    </w:p>
+    <w:p>
+      <w:pPr>
+        <w:pStyle w:val="Lijstopsomteken"/>
+      </w:pPr>
+      <w:r>
+        <w:t>Monitor filter loading (ΔP gauge or indicator) and schedule inspection / replacement before the end-of-life pressure drop is reached.</w:t>
+      </w:r>
+    </w:p>
+    <w:p>
+      <w:pPr>
+        <w:pStyle w:val="Lijstopsomteken"/>
+      </w:pPr>
+      <w:r>
+        <w:t>Confirm the selected filter and valve data against the manufacturer datasheet, and verify local hydrogen stratification by CFD as recommended in Section 8.</w:t>
+      </w:r>
+    </w:p>
+    <w:p>
+      <w:pPr/>
+      <w:r>
+        <w:t>References and standards used in this assessment:</w:t>
+      </w:r>
+    </w:p>
+    <w:p>
+      <w:pPr>
+        <w:pStyle w:val="Lijstopsomteken"/>
+      </w:pPr>
+      <w:r>
+        <w:t>EN 779:2012 – Particulate air filters for general ventilation: G1–G4 / M / F classification and recommended final pressure drop (250 Pa for coarse/medium classes).</w:t>
+      </w:r>
+    </w:p>
+    <w:p>
+      <w:pPr>
+        <w:pStyle w:val="Lijstopsomteken"/>
+      </w:pPr>
+      <w:r>
+        <w:t>ISO 16890-1:2016 – Air filters for general ventilation: classification (ISO Coarse ≈ former G4).</w:t>
+      </w:r>
+    </w:p>
+    <w:p>
+      <w:pPr>
+        <w:pStyle w:val="Lijstopsomteken"/>
+      </w:pPr>
+      <w:r>
+        <w:t>Eurovent 4/21 (4/23) – energy classification and typical initial pressure drop of G4 panel filters.</w:t>
+      </w:r>
+    </w:p>
+    <w:p>
+      <w:pPr>
+        <w:pStyle w:val="Lijstopsomteken"/>
+      </w:pPr>
+      <w:r>
+        <w:t>Representative manufacturer data – Camfil (30/30), MANN+HUMMEL, AAF, Freudenberg Viledon G4 panels: 592×592 mm, ≈ 3400 m³/h, initial ΔP ≈ 45–65 Pa, final ΔP 250 Pa (values to be confirmed against the selected datasheet).</w:t>
+      </w:r>
+    </w:p>
+    <w:p>
+      <w:pPr>
+        <w:pStyle w:val="Lijstopsomteken"/>
+      </w:pPr>
+      <w:r>
+        <w:t>API Standard 2000 / EN ISO 28300 – venting of low-pressure tanks (relief-valve set pressures); EN ISO 4126 – safety devices against excessive pressure.</w:t>
+      </w:r>
+    </w:p>
+    <w:p>
+      <w:pPr>
+        <w:pStyle w:val="Lijstopsomteken"/>
+      </w:pPr>
+      <w:r>
+        <w:t>NFPA 68 / EN 14994 – deflagration (explosion) venting; NFPA 855, IEC 62933-5-2, UL 9540A – BESS safety; NFPA 2 / ISO/TR 15916 – hydrogen safety (H₂ LEL 4 %vol; 1 %vol = 25 % LEL).</w:t>
+      </w:r>
+    </w:p>
+    <w:p>
       <w:pPr>
         <w:pStyle w:val="Kop1"/>
       </w:pPr>
@@ -5410,6 +6893,14 @@
       <w:r>
         <w:lastRenderedPageBreak/>
         <w:t>0.03 m² after allowing for any grille, membrane or filter; a small margin (towards ~0.04 m²) is advised.</w:t>
+      </w:r>
+    </w:p>
+    <w:p>
+      <w:pPr>
+        <w:pStyle w:val="Lijstopsomteken"/>
+      </w:pPr>
+      <w:r>
+        <w:t>Practical venting solution: of the three options evaluated (open vent, G4 filter, overpressure valve), a G4-filtered high-mounted vent with ≥ 0.29 m² net media face (one 592 × 592 mm G4 panel, sized on the 250 Pa end-of-life resistance with a 1.5 safety factor) is recommended – it holds the peak hydrogen concentration at ≈ 0.73 %vol while protecting against dust and water; an overpressure valve is unsuitable as the primary vent because its cracking pressure greatly exceeds the ≈ 79 Pa generated, and is recommended only as supplementary overpressure / deflagration protection.</w:t>
       </w:r>
     </w:p>
     <w:p>

</xml_diff>